<commit_message>
Update workshop script with final felicitation order and roles
Co-Authored-By: Claude Opus 5.5 <noreply@anthropic.com>
Claude-Session: https://claude.ai/code/session_0142jdaaJCcaauCsTbMst25M
</commit_message>
<xml_diff>
--- a/session-scripts/Flutter_Firebase_Workshop_Script.docx
+++ b/session-scripts/Flutter_Firebase_Workshop_Script.docx
@@ -80,7 +80,7 @@
           <w:sz w:val="21"/>
           <w:szCs w:val="21"/>
         </w:rPr>
-        <w:t xml:space="preserve">ANCHOR: [Anchor Name]</w:t>
+        <w:t xml:space="preserve">ANCHORS: Kazi Bushra &amp; Hajra</w:t>
       </w:r>
     </w:p>
     <w:p>
@@ -96,7 +96,7 @@
           <w:sz w:val="20"/>
           <w:szCs w:val="20"/>
         </w:rPr>
-        <w:t xml:space="preserve">Running time (anchor portions only):</w:t>
+        <w:t xml:space="preserve">Running time (excluding the workshop itself):</w:t>
       </w:r>
       <w:r>
         <w:rPr>
@@ -105,7 +105,7 @@
           <w:sz w:val="20"/>
           <w:szCs w:val="20"/>
         </w:rPr>
-        <w:t xml:space="preserve"> Opening &amp; Recitation ~3 min · Felicitation ~3 min · Programme &amp; Speaker Introduction ~4 min · Conclusion &amp; Vote of Thanks ~5 min = </w:t>
+        <w:t xml:space="preserve"> Opening &amp; Recitation ~3 min · Felicitation ~3 min · Programme &amp; Speaker Introduction ~4 min · Conclusion, Vote of Thanks &amp; Closure ~5 min = </w:t>
       </w:r>
       <w:r>
         <w:rPr>
@@ -189,7 +189,7 @@
           <w:sz w:val="24"/>
           <w:szCs w:val="24"/>
         </w:rPr>
-        <w:t xml:space="preserve">A very good afternoon to our respected Principal, Dr. Mohd Shafi Pathan Sir; our respected Head of Department, Dr. Jameer Kotwal Sir; our distinguished guest speaker, Mr. Muhammad Zakaullah; our workshop coordinators, Dr. Muhib Lambay Sir and Prof. Sharique Ahmad Sir; all the faculty members; and my dear students of Third Year CSE (AI &amp; ML).</w:t>
+        <w:t xml:space="preserve">A very good afternoon to our respected In-charge Principal, Dr. Ganesh Kame Sir; our respected Head of Department, Dr. Jameer Kotwal Sir; our distinguished guest speaker, Mr. Muhammad Zakaullah; our workshop coordinators, Dr. Muhib Lambay Sir and Prof. Sharique Ahmad Sir; all the faculty members; and my dear students of Third Year CSE (AI &amp; ML).</w:t>
       </w:r>
     </w:p>
     <w:p>
@@ -246,7 +246,7 @@
           <w:sz w:val="24"/>
           <w:szCs w:val="24"/>
         </w:rPr>
-        <w:t xml:space="preserve">To begin this programme on a blessed note, I would like to invite [Name] for the recitation of the Holy Quran.</w:t>
+        <w:t xml:space="preserve">To begin this programme on a blessed note, I would like to invite Mr. Musaddik Chogle, a student of TE CSE (AI &amp; ML), for the recitation of the Holy Quran.</w:t>
       </w:r>
     </w:p>
     <w:p>
@@ -348,7 +348,7 @@
           <w:sz w:val="24"/>
           <w:szCs w:val="24"/>
         </w:rPr>
-        <w:t xml:space="preserve">May I first request our respected Principal, Dr. Mohd Shafi Pathan Sir, to kindly come forward and felicitate our distinguished guest speaker, Mr. Muhammad Zakaullah.</w:t>
+        <w:t xml:space="preserve">May I first request our respected In-charge Principal, Dr. Ganesh Kame Sir, to kindly come forward and felicitate our distinguished guest speaker, Mr. Muhammad Zakaullah, with a memento.</w:t>
       </w:r>
     </w:p>
     <w:p>
@@ -364,7 +364,7 @@
           <w:sz w:val="21"/>
           <w:szCs w:val="21"/>
         </w:rPr>
-        <w:t xml:space="preserve">(Principal presents bouquet / memento to the Guest Speaker)</w:t>
+        <w:t xml:space="preserve">(Dr. Ganesh Kame presents memento to the Guest Speaker)</w:t>
       </w:r>
     </w:p>
     <w:p>
@@ -390,7 +390,7 @@
           <w:sz w:val="24"/>
           <w:szCs w:val="24"/>
         </w:rPr>
-        <w:t xml:space="preserve">May I now request our respected Head of Department, Dr. Jameer Kotwal Sir, to kindly come forward and felicitate our respected Principal.</w:t>
+        <w:t xml:space="preserve">May I now request our respected Head of Department, Dr. Jameer Kotwal Sir, to kindly come forward and felicitate our respected In-charge Principal, Dr. Ganesh Kame Sir.</w:t>
       </w:r>
     </w:p>
     <w:p>
@@ -406,7 +406,7 @@
           <w:sz w:val="21"/>
           <w:szCs w:val="21"/>
         </w:rPr>
-        <w:t xml:space="preserve">(HoD presents bouquet / memento to the Principal)</w:t>
+        <w:t xml:space="preserve">(Dr. Jameer Kotwal felicitates Dr. Ganesh Kame)</w:t>
       </w:r>
     </w:p>
     <w:p>
@@ -432,7 +432,7 @@
           <w:sz w:val="24"/>
           <w:szCs w:val="24"/>
         </w:rPr>
-        <w:t xml:space="preserve">And may I request our workshop coordinators, Dr. Muhib Lambay Sir and Prof. Sharique Ahmad Sir, to kindly come forward and felicitate our respected Head of Department.</w:t>
+        <w:t xml:space="preserve">And may I request Dr. Muhib Lambay Sir, Assistant Professor, CSE (AI &amp; ML), to kindly come forward and felicitate our respected Head of Department, Dr. Jameer Kotwal Sir.</w:t>
       </w:r>
     </w:p>
     <w:p>
@@ -448,20 +448,20 @@
           <w:sz w:val="21"/>
           <w:szCs w:val="21"/>
         </w:rPr>
-        <w:t xml:space="preserve">(Coordinators present bouquet / memento to the HoD)</w:t>
-      </w:r>
-    </w:p>
-    <w:p>
-      <w:pPr>
-        <w:spacing w:after="120" w:line="300"/>
-      </w:pPr>
-      <w:r>
-        <w:rPr>
-          <w:rFonts w:ascii="Times New Roman" w:cs="Times New Roman" w:eastAsia="Times New Roman" w:hAnsi="Times New Roman"/>
-          <w:sz w:val="24"/>
-          <w:szCs w:val="24"/>
-        </w:rPr>
-        <w:t xml:space="preserve">Thank you, Sirs. Please, a warm round of applause for all our dignitaries.</w:t>
+        <w:t xml:space="preserve">(Dr. Muhib Lambay felicitates Dr. Jameer Kotwal)</w:t>
+      </w:r>
+    </w:p>
+    <w:p>
+      <w:pPr>
+        <w:spacing w:after="120" w:line="300"/>
+      </w:pPr>
+      <w:r>
+        <w:rPr>
+          <w:rFonts w:ascii="Times New Roman" w:cs="Times New Roman" w:eastAsia="Times New Roman" w:hAnsi="Times New Roman"/>
+          <w:sz w:val="24"/>
+          <w:szCs w:val="24"/>
+        </w:rPr>
+        <w:t xml:space="preserve">Thank you, Sir. Please, a warm round of applause for all our dignitaries.</w:t>
       </w:r>
     </w:p>
     <w:p>
@@ -1008,7 +1008,7 @@
           <w:sz w:val="19"/>
           <w:szCs w:val="19"/>
         </w:rPr>
-        <w:t xml:space="preserve">   ~3 min</w:t>
+        <w:t xml:space="preserve">   ~2 min</w:t>
       </w:r>
     </w:p>
     <w:p>
@@ -1037,7 +1037,36 @@
           <w:sz w:val="24"/>
           <w:szCs w:val="24"/>
         </w:rPr>
-        <w:t xml:space="preserve">As we formally conclude this programme, I would like to express our heartfelt gratitude to everyone who made today's workshop a success.</w:t>
+        <w:t xml:space="preserve">To deliver the vote of thanks, may I now invite Mr. Asjad Khan, a student of TE CSE (AI &amp; ML).</w:t>
+      </w:r>
+    </w:p>
+    <w:p>
+      <w:pPr>
+        <w:spacing w:after="40" w:before="120"/>
+      </w:pPr>
+      <w:r>
+        <w:rPr>
+          <w:rFonts w:ascii="Times New Roman" w:cs="Times New Roman" w:eastAsia="Times New Roman" w:hAnsi="Times New Roman"/>
+          <w:b/>
+          <w:bCs/>
+          <w:color w:val="1F3A8A"/>
+          <w:sz w:val="22"/>
+          <w:szCs w:val="22"/>
+        </w:rPr>
+        <w:t xml:space="preserve">MR. ASJAD KHAN (Student, TE CSE AI &amp; ML)</w:t>
+      </w:r>
+    </w:p>
+    <w:p>
+      <w:pPr>
+        <w:spacing w:after="120" w:line="300"/>
+      </w:pPr>
+      <w:r>
+        <w:rPr>
+          <w:rFonts w:ascii="Times New Roman" w:cs="Times New Roman" w:eastAsia="Times New Roman" w:hAnsi="Times New Roman"/>
+          <w:sz w:val="24"/>
+          <w:szCs w:val="24"/>
+        </w:rPr>
+        <w:t xml:space="preserve">As we come to the end of this programme, I would like to express our heartfelt gratitude to everyone who made today's workshop a success.</w:t>
       </w:r>
     </w:p>
     <w:p>
@@ -1063,7 +1092,7 @@
           <w:sz w:val="24"/>
           <w:szCs w:val="24"/>
         </w:rPr>
-        <w:t xml:space="preserve">Our sincere thanks to our respected Principal, Dr. Mohd Shafi Pathan Sir, for his constant encouragement and support.</w:t>
+        <w:t xml:space="preserve">Our sincere thanks to our respected In-charge Principal, Dr. Ganesh Kame Sir, for his constant encouragement and support.</w:t>
       </w:r>
     </w:p>
     <w:p>
@@ -1128,7 +1157,67 @@
           <w:sz w:val="24"/>
           <w:szCs w:val="24"/>
         </w:rPr>
-        <w:t xml:space="preserve">On this note, we formally conclude the Hands-On Workshop on Cross-Platform App Development with Flutter &amp; Firebase. Students are welcome to approach Mr. Zakaullah with any further questions.</w:t>
+        <w:t xml:space="preserve">Thank you.</w:t>
+      </w:r>
+    </w:p>
+    <w:p>
+      <w:pPr>
+        <w:keepNext/>
+        <w:pBdr>
+          <w:bottom w:val="single" w:color="1F3A8A" w:sz="12" w:space="2"/>
+        </w:pBdr>
+        <w:spacing w:after="120" w:before="360"/>
+      </w:pPr>
+      <w:r>
+        <w:rPr>
+          <w:rFonts w:ascii="Times New Roman" w:cs="Times New Roman" w:eastAsia="Times New Roman" w:hAnsi="Times New Roman"/>
+          <w:b/>
+          <w:bCs/>
+          <w:color w:val="1F3A8A"/>
+          <w:sz w:val="29"/>
+          <w:szCs w:val="29"/>
+        </w:rPr>
+        <w:t xml:space="preserve">CLOSURE</w:t>
+      </w:r>
+      <w:r>
+        <w:rPr>
+          <w:rFonts w:ascii="Times New Roman" w:cs="Times New Roman" w:eastAsia="Times New Roman" w:hAnsi="Times New Roman"/>
+          <w:i/>
+          <w:iCs/>
+          <w:color w:val="7A869E"/>
+          <w:sz w:val="19"/>
+          <w:szCs w:val="19"/>
+        </w:rPr>
+        <w:t xml:space="preserve">   ~1 min</w:t>
+      </w:r>
+    </w:p>
+    <w:p>
+      <w:pPr>
+        <w:spacing w:after="40" w:before="120"/>
+      </w:pPr>
+      <w:r>
+        <w:rPr>
+          <w:rFonts w:ascii="Times New Roman" w:cs="Times New Roman" w:eastAsia="Times New Roman" w:hAnsi="Times New Roman"/>
+          <w:b/>
+          <w:bCs/>
+          <w:color w:val="1F3A8A"/>
+          <w:sz w:val="22"/>
+          <w:szCs w:val="22"/>
+        </w:rPr>
+        <w:t xml:space="preserve">ANCHOR</w:t>
+      </w:r>
+    </w:p>
+    <w:p>
+      <w:pPr>
+        <w:spacing w:after="120" w:line="300"/>
+      </w:pPr>
+      <w:r>
+        <w:rPr>
+          <w:rFonts w:ascii="Times New Roman" w:cs="Times New Roman" w:eastAsia="Times New Roman" w:hAnsi="Times New Roman"/>
+          <w:sz w:val="24"/>
+          <w:szCs w:val="24"/>
+        </w:rPr>
+        <w:t xml:space="preserve">Thank you, Asjad. On this note, we formally conclude the Hands-On Workshop on Cross-Platform App Development with Flutter &amp; Firebase. Students are welcome to approach Mr. Zakaullah with any further questions.</w:t>
       </w:r>
     </w:p>
     <w:p>

</xml_diff>